<commit_message>
Obsidian backup: 2026-03-16 12:53:12
</commit_message>
<xml_diff>
--- a/582_capstone/peer_review_1.docx
+++ b/582_capstone/peer_review_1.docx
@@ -185,7 +185,8 @@
           <w:p>
             <w:pPr>
               <w:pStyle w:val="Normal"/>
-              <w:widowControl/>
+              <w:widowControl w:val="false"/>
+              <w:suppressAutoHyphens w:val="true"/>
               <w:spacing w:lineRule="auto" w:line="240" w:before="0" w:after="120"/>
               <w:jc w:val="center"/>
               <w:rPr>
@@ -217,7 +218,8 @@
           <w:p>
             <w:pPr>
               <w:pStyle w:val="Normal"/>
-              <w:widowControl/>
+              <w:widowControl w:val="false"/>
+              <w:suppressAutoHyphens w:val="true"/>
               <w:spacing w:lineRule="auto" w:line="240" w:before="0" w:after="120"/>
               <w:jc w:val="center"/>
               <w:rPr>
@@ -249,7 +251,8 @@
           <w:p>
             <w:pPr>
               <w:pStyle w:val="Normal"/>
-              <w:widowControl/>
+              <w:widowControl w:val="false"/>
+              <w:suppressAutoHyphens w:val="true"/>
               <w:spacing w:lineRule="auto" w:line="240" w:before="0" w:after="120"/>
               <w:jc w:val="center"/>
               <w:rPr>
@@ -286,7 +289,8 @@
           <w:p>
             <w:pPr>
               <w:pStyle w:val="Normal"/>
-              <w:widowControl/>
+              <w:widowControl w:val="false"/>
+              <w:suppressAutoHyphens w:val="true"/>
               <w:spacing w:lineRule="auto" w:line="240" w:before="0" w:after="120"/>
               <w:jc w:val="center"/>
               <w:rPr>
@@ -318,7 +322,8 @@
           <w:p>
             <w:pPr>
               <w:pStyle w:val="Normal"/>
-              <w:widowControl/>
+              <w:widowControl w:val="false"/>
+              <w:suppressAutoHyphens w:val="true"/>
               <w:spacing w:lineRule="auto" w:line="240" w:before="0" w:after="120"/>
               <w:jc w:val="center"/>
               <w:rPr>
@@ -350,7 +355,8 @@
           <w:p>
             <w:pPr>
               <w:pStyle w:val="Normal"/>
-              <w:widowControl/>
+              <w:widowControl w:val="false"/>
+              <w:suppressAutoHyphens w:val="true"/>
               <w:spacing w:lineRule="auto" w:line="240" w:before="0" w:after="120"/>
               <w:jc w:val="center"/>
               <w:rPr>
@@ -369,7 +375,7 @@
                 <w:szCs w:val="22"/>
                 <w:lang w:val="en-US" w:eastAsia="en-US" w:bidi="ar-SA"/>
               </w:rPr>
-              <w:t>2500</w:t>
+              <w:t>3334</w:t>
             </w:r>
           </w:p>
         </w:tc>
@@ -387,7 +393,8 @@
           <w:p>
             <w:pPr>
               <w:pStyle w:val="Normal"/>
-              <w:widowControl/>
+              <w:widowControl w:val="false"/>
+              <w:suppressAutoHyphens w:val="true"/>
               <w:spacing w:lineRule="auto" w:line="240" w:before="0" w:after="120"/>
               <w:jc w:val="center"/>
               <w:rPr>
@@ -419,7 +426,8 @@
           <w:p>
             <w:pPr>
               <w:pStyle w:val="Normal"/>
-              <w:widowControl/>
+              <w:widowControl w:val="false"/>
+              <w:suppressAutoHyphens w:val="true"/>
               <w:spacing w:lineRule="auto" w:line="240" w:before="0" w:after="120"/>
               <w:jc w:val="center"/>
               <w:rPr>
@@ -451,7 +459,8 @@
           <w:p>
             <w:pPr>
               <w:pStyle w:val="Normal"/>
-              <w:widowControl/>
+              <w:widowControl w:val="false"/>
+              <w:suppressAutoHyphens w:val="true"/>
               <w:spacing w:lineRule="auto" w:line="240" w:before="0" w:after="120"/>
               <w:jc w:val="center"/>
               <w:rPr>
@@ -470,7 +479,7 @@
                 <w:szCs w:val="22"/>
                 <w:lang w:val="en-US" w:eastAsia="en-US" w:bidi="ar-SA"/>
               </w:rPr>
-              <w:t>2500</w:t>
+              <w:t>3333</w:t>
             </w:r>
           </w:p>
         </w:tc>
@@ -488,7 +497,8 @@
           <w:p>
             <w:pPr>
               <w:pStyle w:val="Normal"/>
-              <w:widowControl/>
+              <w:widowControl w:val="false"/>
+              <w:suppressAutoHyphens w:val="true"/>
               <w:spacing w:lineRule="auto" w:line="240" w:before="0" w:after="120"/>
               <w:jc w:val="center"/>
               <w:rPr>
@@ -520,7 +530,8 @@
           <w:p>
             <w:pPr>
               <w:pStyle w:val="Normal"/>
-              <w:widowControl/>
+              <w:widowControl w:val="false"/>
+              <w:suppressAutoHyphens w:val="true"/>
               <w:spacing w:lineRule="auto" w:line="240" w:before="0" w:after="120"/>
               <w:jc w:val="center"/>
               <w:rPr>
@@ -552,7 +563,8 @@
           <w:p>
             <w:pPr>
               <w:pStyle w:val="Normal"/>
-              <w:widowControl/>
+              <w:widowControl w:val="false"/>
+              <w:suppressAutoHyphens w:val="true"/>
               <w:spacing w:lineRule="auto" w:line="240" w:before="0" w:after="120"/>
               <w:jc w:val="center"/>
               <w:rPr>
@@ -571,7 +583,7 @@
                 <w:szCs w:val="22"/>
                 <w:lang w:val="en-US" w:eastAsia="en-US" w:bidi="ar-SA"/>
               </w:rPr>
-              <w:t>2500</w:t>
+              <w:t>3333</w:t>
             </w:r>
           </w:p>
         </w:tc>
@@ -589,7 +601,8 @@
           <w:p>
             <w:pPr>
               <w:pStyle w:val="Normal"/>
-              <w:widowControl/>
+              <w:widowControl w:val="false"/>
+              <w:suppressAutoHyphens w:val="true"/>
               <w:spacing w:lineRule="auto" w:line="240" w:before="0" w:after="120"/>
               <w:jc w:val="center"/>
               <w:rPr>
@@ -601,14 +614,7 @@
               </w:rPr>
             </w:pPr>
             <w:r>
-              <w:rPr>
-                <w:rFonts w:eastAsia="Calibri" w:cs=""/>
-                <w:kern w:val="0"/>
-                <w:sz w:val="22"/>
-                <w:szCs w:val="22"/>
-                <w:lang w:val="en-US" w:eastAsia="en-US" w:bidi="ar-SA"/>
-              </w:rPr>
-              <w:t>Sutherland</w:t>
+              <w:rPr/>
             </w:r>
           </w:p>
         </w:tc>
@@ -621,7 +627,8 @@
           <w:p>
             <w:pPr>
               <w:pStyle w:val="Normal"/>
-              <w:widowControl/>
+              <w:widowControl w:val="false"/>
+              <w:suppressAutoHyphens w:val="true"/>
               <w:spacing w:lineRule="auto" w:line="240" w:before="0" w:after="120"/>
               <w:jc w:val="center"/>
               <w:rPr>
@@ -633,14 +640,7 @@
               </w:rPr>
             </w:pPr>
             <w:r>
-              <w:rPr>
-                <w:rFonts w:eastAsia="Calibri" w:cs=""/>
-                <w:kern w:val="0"/>
-                <w:sz w:val="22"/>
-                <w:szCs w:val="22"/>
-                <w:lang w:val="en-US" w:eastAsia="en-US" w:bidi="ar-SA"/>
-              </w:rPr>
-              <w:t>David</w:t>
+              <w:rPr/>
             </w:r>
           </w:p>
         </w:tc>
@@ -653,7 +653,8 @@
           <w:p>
             <w:pPr>
               <w:pStyle w:val="Normal"/>
-              <w:widowControl/>
+              <w:widowControl w:val="false"/>
+              <w:suppressAutoHyphens w:val="true"/>
               <w:spacing w:lineRule="auto" w:line="240" w:before="0" w:after="120"/>
               <w:jc w:val="center"/>
               <w:rPr>
@@ -665,14 +666,7 @@
               </w:rPr>
             </w:pPr>
             <w:r>
-              <w:rPr>
-                <w:rFonts w:eastAsia="Calibri" w:cs=""/>
-                <w:kern w:val="0"/>
-                <w:sz w:val="22"/>
-                <w:szCs w:val="22"/>
-                <w:lang w:val="en-US" w:eastAsia="en-US" w:bidi="ar-SA"/>
-              </w:rPr>
-              <w:t>2500</w:t>
+              <w:rPr/>
             </w:r>
           </w:p>
         </w:tc>
@@ -1491,6 +1485,7 @@
     <w:rsid w:val="0029631e"/>
     <w:pPr>
       <w:widowControl/>
+      <w:suppressAutoHyphens w:val="true"/>
       <w:bidi w:val="0"/>
       <w:spacing w:lineRule="auto" w:line="276" w:before="0" w:after="0"/>
       <w:jc w:val="left"/>

</xml_diff>

<commit_message>
Obsidian backup: 2026-04-22 13:41:45
</commit_message>
<xml_diff>
--- a/582_capstone/peer_review_1.docx
+++ b/582_capstone/peer_review_1.docx
@@ -614,7 +614,14 @@
               </w:rPr>
             </w:pPr>
             <w:r>
-              <w:rPr/>
+              <w:rPr>
+                <w:rFonts w:eastAsia="Calibri" w:cs=""/>
+                <w:kern w:val="0"/>
+                <w:sz w:val="22"/>
+                <w:szCs w:val="22"/>
+                <w:lang w:val="en-US" w:eastAsia="en-US" w:bidi="ar-SA"/>
+              </w:rPr>
+              <w:t>Sutherland</w:t>
             </w:r>
           </w:p>
         </w:tc>
@@ -640,7 +647,14 @@
               </w:rPr>
             </w:pPr>
             <w:r>
-              <w:rPr/>
+              <w:rPr>
+                <w:rFonts w:eastAsia="Calibri" w:cs=""/>
+                <w:kern w:val="0"/>
+                <w:sz w:val="22"/>
+                <w:szCs w:val="22"/>
+                <w:lang w:val="en-US" w:eastAsia="en-US" w:bidi="ar-SA"/>
+              </w:rPr>
+              <w:t>David</w:t>
             </w:r>
           </w:p>
         </w:tc>
@@ -666,7 +680,14 @@
               </w:rPr>
             </w:pPr>
             <w:r>
-              <w:rPr/>
+              <w:rPr>
+                <w:rFonts w:eastAsia="Calibri" w:cs=""/>
+                <w:kern w:val="0"/>
+                <w:sz w:val="22"/>
+                <w:szCs w:val="22"/>
+                <w:lang w:val="en-US" w:eastAsia="en-US" w:bidi="ar-SA"/>
+              </w:rPr>
+              <w:t>0</w:t>
             </w:r>
           </w:p>
         </w:tc>

</xml_diff>